<commit_message>
A3: post-deposit update with minted Zenodo DOI 10.5281/zenodo.20102987 (chain ref A1 20102979 + A2 20102959)
</commit_message>
<xml_diff>
--- a/04_manuscript/A3/manuscript.docx
+++ b/04_manuscript/A3/manuscript.docx
@@ -2093,7 +2093,7 @@
         <w:t xml:space="preserve">02_code/10_A3_methodological_figs.R</w:t>
       </w:r>
       <w:r>
-        <w:t xml:space="preserve">. All scripts and outputs are deposited at Zenodo (concept DOI 10.5281/zenodo.19743544) and on GitHub (</w:t>
+        <w:t xml:space="preserve">. All scripts and outputs are deposited at Zenodo (concept DOI 10.5281/zenodo.19743544; v3·0-A3 DOI 10.5281/zenodo.20102987) and on GitHub (</w:t>
       </w:r>
       <w:r>
         <w:rPr>
@@ -3280,7 +3280,7 @@
         <w:t xml:space="preserve">2829cd78018e411783671ec00f849647858bda552cfa4ec23ad505ba9704a117</w:t>
       </w:r>
       <w:r>
-        <w:t xml:space="preserve">), the 16-script analytic pipeline, the article-specific outputs, and the reproducibility scripts are deposited at Zenodo (concept DOI 10.5281/zenodo.19743544; article-specific version DOIs cited in each manuscript) and GitHub (</w:t>
+        <w:t xml:space="preserve">), the 16-script analytic pipeline, the article-specific outputs, and the reproducibility scripts are deposited at Zenodo (concept DOI 10.5281/zenodo.19743544; A3 v3·0-A3 DOI 10.5281/zenodo.20102987; A1 v3·0-A1 DOI 10.5281/zenodo.20102979; A2 v2·0-A2 DOI 10.5281/zenodo.20102959) and GitHub (</w:t>
       </w:r>
       <w:r>
         <w:rPr>

</xml_diff>